<commit_message>
Add publication robustness and reproducible release pipeline
</commit_message>
<xml_diff>
--- a/paper/Chinese_Rap_Evidence_Grounded_Manuscript.docx
+++ b/paper/Chinese_Rap_Evidence_Grounded_Manuscript.docx
@@ -154,7 +154,7 @@
           <w:color w:val="000000"/>
           <w:sz w:val="24"/>
         </w:rPr>
-        <w:t xml:space="preserve"> Dense–lexical fusion achieves macro mean reciprocal rank (MRR) 0.447 (95% confidence interval [CI] 0.414–0.481), exceeding TF–IDF by 0.031 (0.021–0.042). Shared-text exclusion contracts the NER inventory from 33 to 22 provisional surfaces; six source-label/reference and four co-mention edges survive uncertainty and false-discovery-rate gates, but no precision, recall, or F1 score (the harmonic mean of precision and recall) is claimed. The written-ending context model reaches Top-3 0.695 (0.685–0.705), improving on Markov by 0.050 (0.044–0.055); source-label conditioning has no supported benefit.</w:t>
+        <w:t xml:space="preserve"> Dense–lexical fusion achieves macro mean reciprocal rank (MRR) 0.447 (95% confidence interval [CI] 0.414–0.481), exceeding TF–IDF by 0.031 (0.021–0.042); a sixfold training-only sensitivity preserves this advantage. Shared-text exclusion contracts the NER inventory from 33 to 22 provisional surfaces; six source-label/reference and four co-mention edges survive uncertainty and false-discovery-rate gates, but no precision, recall, or F1 score (the harmonic mean of precision and recall) is claimed. The written-ending context model reaches Top-3 0.695 (0.685–0.705), improving on Markov by 0.050 (0.044–0.055); source-label conditioning has no supported benefit.</w:t>
       </w:r>
     </w:p>
     <w:p>
@@ -891,7 +891,7 @@
           <w:color w:val="000000"/>
           <w:sz w:val="24"/>
         </w:rPr>
-        <w:t>The frozen canonical snapshot contains 7,211 songs and 22,128 lyric chunks. A derived clean-text sidecar preserves the canonical keys while applying deterministic text and metadata gates. All 22,128 chunk keys reconcile one-to-one with the sidecar; 21,553 chunks are eligible clean text and 575 metadata-only chunks are withheld. The snapshot contains 241 source-credit labels, of which 226 have at least five songs. Artist/title comparison is eligible for 7,134 songs and ineligible for 77; 102 songs are excluded from title-semantic use. Missing or doubtful values are not silently guessed.</w:t>
+        <w:t>The frozen private snapshot contains 7,211 songs and 22,128 lyric chunks. Deterministic metadata and text gates reconcile every canonical key to a clean-text sidecar, retain 21,553 eligible chunks, and withhold 575 metadata-only chunks. Analyses preserve one song record, split before expanding to chunks, lines, or entity occurrences, and keep identical-content groups within one partition or exclude cross-partition copies; 405 exact groups span 921 songs. Missing or doubtful metadata are never guessed.</w:t>
       </w:r>
     </w:p>
     <w:p>
@@ -906,54 +906,7 @@
           <w:color w:val="000000"/>
           <w:sz w:val="24"/>
         </w:rPr>
-        <w:t>The corpus was supplied as a private frozen export. It lacks per-track URLs or stable platform identifiers, and project records do not verify platforms, acquisition route or dates, temporal coverage, sampling, transcription origin, or rights and ethics basis. It is therefore a convenience snapshot rather than a census, and acquisition is not independently reconstructable. Owner-supplied facts are required before submission and tracked in the author-action record; none is inferred from lyrics or filenames.</w:t>
-      </w:r>
-    </w:p>
-    <w:p>
-      <w:pPr>
-        <w:widowControl/>
-        <w:spacing w:line="480" w:lineRule="auto" w:after="0"/>
-        <w:ind w:firstLine="360"/>
-      </w:pPr>
-      <w:r>
-        <w:rPr>
-          <w:rFonts w:ascii="Times New Roman" w:hAnsi="Times New Roman" w:eastAsia="Times New Roman" w:cs="Times New Roman"/>
-          <w:color w:val="000000"/>
-          <w:sz w:val="24"/>
-        </w:rPr>
-        <w:t xml:space="preserve">Cleaning is necessary but is not the research contribution. The public supplement records hashes, row-count reconciliation, key uniqueness, eligibility flags, and exception totals. The analytical rules are: use only </w:t>
-      </w:r>
-      <w:r>
-        <w:rPr>
-          <w:rFonts w:ascii="Courier New" w:hAnsi="Courier New" w:eastAsia="Courier New" w:cs="Courier New"/>
-          <w:color w:val="000000"/>
-          <w:sz w:val="23"/>
-        </w:rPr>
-        <w:t>analysis_text</w:t>
-      </w:r>
-      <w:r>
-        <w:rPr>
-          <w:rFonts w:ascii="Times New Roman" w:hAnsi="Times New Roman" w:eastAsia="Times New Roman" w:cs="Times New Roman"/>
-          <w:color w:val="000000"/>
-          <w:sz w:val="24"/>
-        </w:rPr>
-        <w:t xml:space="preserve"> marked </w:t>
-      </w:r>
-      <w:r>
-        <w:rPr>
-          <w:rFonts w:ascii="Courier New" w:hAnsi="Courier New" w:eastAsia="Courier New" w:cs="Courier New"/>
-          <w:color w:val="000000"/>
-          <w:sz w:val="23"/>
-        </w:rPr>
-        <w:t>eligible_clean_text</w:t>
-      </w:r>
-      <w:r>
-        <w:rPr>
-          <w:rFonts w:ascii="Times New Roman" w:hAnsi="Times New Roman" w:eastAsia="Times New Roman" w:cs="Times New Roman"/>
-          <w:color w:val="000000"/>
-          <w:sz w:val="24"/>
-        </w:rPr>
-        <w:t>; preserve one canonical song row per song; split at song level before expanding to chunks, lines, or entity occurrences; and keep identical song-content and clean-text hash groups within one partition or remove cross-partition copies. The audit identifies 405 exact song-content groups spanning 921 songs, which makes this grouping material rather than cosmetic.</w:t>
+        <w:t>The export is a convenience snapshot rather than a census. It lacks stable per-track identifiers and verified records for source platforms, acquisition dates, temporal coverage, sampling, transcription origin, and rights or ethics basis. Those owner-supplied facts remain required before submission and are tracked separately; no provenance is inferred from lyrics or filenames. Full reconciliation, exception totals, and checksums appear in the public supplement.</w:t>
       </w:r>
     </w:p>
     <w:p>
@@ -1966,28 +1919,6 @@
     </w:p>
     <w:p>
       <w:pPr>
-        <w:pStyle w:val="Heading2"/>
-      </w:pPr>
-      <w:r>
-        <w:t>4.3 Metrics and Uncertainty</w:t>
-      </w:r>
-    </w:p>
-    <w:p>
-      <w:pPr>
-        <w:widowControl/>
-        <w:spacing w:line="480" w:lineRule="auto" w:after="0"/>
-      </w:pPr>
-      <w:r>
-        <w:rPr>
-          <w:rFonts w:ascii="Times New Roman" w:hAnsi="Times New Roman" w:eastAsia="Times New Roman" w:cs="Times New Roman"/>
-          <w:color w:val="000000"/>
-          <w:sz w:val="24"/>
-        </w:rPr>
-        <w:t>Each result names its inferential unit. Retrieval has one relevant source label per query and reports reciprocal rank, Recall@1/5/10, and normalized discounted cumulative gain at rank 10 (nDCG@10). Its primary estimates are duplicate-component-adjusted macro means across source labels, preventing high-volume labels from determining the conclusion. A paired two-stage bootstrap uses 5,000 fixed-seed replicates. Each replicate samples 204 source-label occurrences with replacement and then independently resamples that occurrence's duplicate components; a label selected twice therefore receives two independent inner draws. The same component draw indexes every system and metric, preserving pairing for model differences (Savoy 1997).</w:t>
-      </w:r>
-    </w:p>
-    <w:p>
-      <w:pPr>
         <w:widowControl/>
         <w:spacing w:line="480" w:lineRule="auto" w:after="0"/>
         <w:ind w:firstLine="360"/>
@@ -1998,7 +1929,29 @@
           <w:color w:val="000000"/>
           <w:sz w:val="24"/>
         </w:rPr>
-        <w:t>Rhyme prediction reports top-1/3/5 accuracy, mean reciprocal rank (MRR), negative log likelihood (NLL), ten-bin expected calibration error (ECE), and coverage. Its 95% intervals use 2,000 resamples of test songs, preserving dependence among lines from the same song. Paired model differences reuse the same song-cluster resamples. Per-label macro results require at least 20 leakage-safe test events.</w:t>
+        <w:t>A sixfold sensitivity analysis fits the same TF–IDF specification only on training-fold texts and compares it with a matched all-corpus fit while holding duplicate-component folds and label profiles fixed (Supplementary Methods S2).</w:t>
+      </w:r>
+    </w:p>
+    <w:p>
+      <w:pPr>
+        <w:pStyle w:val="Heading2"/>
+      </w:pPr>
+      <w:r>
+        <w:t>4.3 Metrics and Uncertainty</w:t>
+      </w:r>
+    </w:p>
+    <w:p>
+      <w:pPr>
+        <w:widowControl/>
+        <w:spacing w:line="480" w:lineRule="auto" w:after="0"/>
+      </w:pPr>
+      <w:r>
+        <w:rPr>
+          <w:rFonts w:ascii="Times New Roman" w:hAnsi="Times New Roman" w:eastAsia="Times New Roman" w:cs="Times New Roman"/>
+          <w:color w:val="000000"/>
+          <w:sz w:val="24"/>
+        </w:rPr>
+        <w:t>Each result names its inferential unit. Retrieval has one relevant source label per query and reports reciprocal rank, Recall@1/5/10, and normalized discounted cumulative gain at rank 10 (nDCG@10). Its primary estimates are duplicate-component-adjusted macro means across source labels, preventing high-volume labels from determining the conclusion. A paired two-stage bootstrap uses 5,000 fixed-seed replicates. Each replicate samples 204 source-label occurrences with replacement and then independently resamples that occurrence's duplicate components; a label selected twice therefore receives two independent inner draws. The same component draw indexes every system and metric, preserving pairing for model differences (Savoy 1997).</w:t>
       </w:r>
     </w:p>
     <w:p>
@@ -2013,7 +1966,7 @@
           <w:color w:val="000000"/>
           <w:sz w:val="24"/>
         </w:rPr>
-        <w:t>The NER extraction layer reports counts and cross-method candidate agreement only. Without adjudicated occurrence truth, agreement is not precision, recall, or an F1 score. The downstream network is evaluated separately: source-label/reference rates receive Jeffreys intervals and all tested label/entity pairs are controlled by Benjamini–Hochberg false-discovery-rate (FDR) correction; co-mentions use hypergeometric tests and a separate FDR family. These intervals quantify fixed-corpus song-unit association, not entity-extraction accuracy or external-population generalization.</w:t>
+        <w:t>Rhyme prediction reports top-1/3/5 accuracy, mean reciprocal rank (MRR), negative log likelihood (NLL), ten-bin expected calibration error (ECE), and coverage. Its 95% intervals use 2,000 resamples of test songs, preserving dependence among lines from the same song. Paired model differences reuse the same song-cluster resamples. Per-label macro results require at least 20 leakage-safe test events.</w:t>
       </w:r>
     </w:p>
     <w:p>
@@ -2028,6 +1981,21 @@
           <w:color w:val="000000"/>
           <w:sz w:val="24"/>
         </w:rPr>
+        <w:t>The NER extraction layer reports counts and cross-method candidate agreement only. Without adjudicated occurrence truth, agreement is not precision, recall, or an F1 score. The downstream network is evaluated separately: source-label/reference rates receive Jeffreys intervals and all tested label/entity pairs are controlled by Benjamini–Hochberg false-discovery-rate (FDR) correction; co-mentions use hypergeometric tests and a separate FDR family. These intervals quantify fixed-corpus song-unit association, not entity-extraction accuracy or external-population generalization.</w:t>
+      </w:r>
+    </w:p>
+    <w:p>
+      <w:pPr>
+        <w:widowControl/>
+        <w:spacing w:line="480" w:lineRule="auto" w:after="0"/>
+        <w:ind w:firstLine="360"/>
+      </w:pPr>
+      <w:r>
+        <w:rPr>
+          <w:rFonts w:ascii="Times New Roman" w:hAnsi="Times New Roman" w:eastAsia="Times New Roman" w:cs="Times New Roman"/>
+          <w:color w:val="000000"/>
+          <w:sz w:val="24"/>
+        </w:rPr>
         <w:t>Fig. 1 summarizes the common evidence controls and the task-specific estimands and claim boundaries.</w:t>
       </w:r>
     </w:p>
@@ -2041,7 +2009,7 @@
         <w:drawing>
           <wp:inline xmlns:a="http://schemas.openxmlformats.org/drawingml/2006/main" xmlns:pic="http://schemas.openxmlformats.org/drawingml/2006/picture">
             <wp:extent cx="5715000" cy="3824653"/>
-            <wp:docPr id="1" name="Picture 1" descr="A top-to-bottom research pipeline begins with a frozen Chinese-rap lyric corpus and a shared evidence-control block. Three branches follow: repertoire retrieval using BGE-M3, character TF–IDF, and fusion; provisional cultural-reference extraction using lexicon and contextual Chinese NER evidence; and written-rhyme prediction using terminal-Han pinyin-final families and context models. Each branch states a boundary against identity, social-relation, or performed-rhyme claims." title="A top-to-bottom research pipeline begins with a frozen Chinese-rap lyric corpus "/>
+            <wp:docPr id="1" name="Picture 1" descr="A top-to-bottom research pipeline begins with a frozen Chinese-rap lyric corpus and a shared evidence-control block. Three branches follow: repertoire retrieval using BGE-M3, character TF–IDF, and fusion; provisional cultural-reference extraction using lexicon and contextual Chinese NER evidence; and written-rhyme prediction using terminal-Han pinyin-final families and context models. “Lyrical identity” is defined as a corpus-relative source-label repertoire; the branches reject verified-person, authorship, social-relation, and performed-rhyme claims." title="A top-to-bottom research pipeline begins with a frozen Chinese-rap lyric corpus "/>
             <wp:cNvGraphicFramePr>
               <a:graphicFrameLocks noChangeAspect="1"/>
             </wp:cNvGraphicFramePr>
@@ -2095,7 +2063,7 @@
           <w:color w:val="000000"/>
           <w:sz w:val="18"/>
         </w:rPr>
-        <w:t>Alt text: A top-to-bottom research pipeline begins with a frozen Chinese-rap lyric corpus and a shared evidence-control block. Three branches follow: repertoire retrieval using BGE-M3, character TF–IDF, and fusion; provisional cultural-reference extraction using lexicon and contextual Chinese NER evidence; and written-rhyme prediction using terminal-Han pinyin-final families and context models. Each branch states a boundary against identity, social-relation, or performed-rhyme claims.</w:t>
+        <w:t>Alt text: A top-to-bottom research pipeline begins with a frozen Chinese-rap lyric corpus and a shared evidence-control block. Three branches follow: repertoire retrieval using BGE-M3, character TF–IDF, and fusion; provisional cultural-reference extraction using lexicon and contextual Chinese NER evidence; and written-rhyme prediction using terminal-Han pinyin-final families and context models. “Lyrical identity” is defined as a corpus-relative source-label repertoire; the branches reject verified-person, authorship, social-relation, and performed-rhyme claims.</w:t>
       </w:r>
     </w:p>
     <w:p>
@@ -2313,6 +2281,21 @@
           <w:sz w:val="24"/>
         </w:rPr>
         <w:t>Character TF–IDF outperforms BGE-M3 dense retrieval on every primary metric, but their standardized fusion is better than either component (Table 2; Fig. 2). Fusion reaches macro MRR 0.447 (95% confidence interval [CI] 0.414–0.481) and Recall@10 0.611 (0.577–0.646). Its MRR advantage over TF–IDF is 0.031 (paired 95% CI 0.021–0.042); its Recall@10 advantage is 0.050 (0.033–0.066). Against BGE-M3, the fusion gains are larger: MRR +0.127 (0.106–0.147) and Recall@10 +0.103 (0.079–0.127). All five fusion-versus-component intervals are above zero.</w:t>
+      </w:r>
+    </w:p>
+    <w:p>
+      <w:pPr>
+        <w:widowControl/>
+        <w:spacing w:line="480" w:lineRule="auto" w:after="0"/>
+        <w:ind w:firstLine="360"/>
+      </w:pPr>
+      <w:r>
+        <w:rPr>
+          <w:rFonts w:ascii="Times New Roman" w:hAnsi="Times New Roman" w:eastAsia="Times New Roman" w:cs="Times New Roman"/>
+          <w:color w:val="000000"/>
+          <w:sz w:val="24"/>
+        </w:rPr>
+        <w:t>Under sixfold training-only fitting, fusion MRR remains 0.440 versus 0.405 for TF–IDF (difference +0.035, 95% CI 0.024–0.046). Matched transductive exposure adds only 0.004 MRR to either TF–IDF or fusion (+0.003963 and +0.003681, respectively); this small optimism cannot account for the fusion gain.</w:t>
       </w:r>
     </w:p>
     <w:tbl>
@@ -3151,7 +3134,24 @@
           <w:color w:val="000000"/>
           <w:sz w:val="24"/>
         </w:rPr>
-        <w:t>For the global layout, normalized centroids from the two text treatments are combined and projected by deterministic principal-components analysis. The first two components retain 26.2% of profile variation. Position is therefore an approximate overview for navigation; only a retained line defines a released match, and screen distance alone is not interpreted. The focused ego diagram below it uses a circular navigation layout whose angle and radius carry no analytical meaning.</w:t>
+        <w:t xml:space="preserve">The 86 cross-treatment matches are far above a degree-controlled null. Holding the primary graph fixed and rewiring the sensitivity graph while preserving every label's degree produced a mean overlap of 4.52 edges (95% null range 1–9; maximum 13) across 10,000 replicates; none reached the observed 86 (add-one Monte Carlo </w:t>
+      </w:r>
+      <w:r>
+        <w:rPr>
+          <w:rFonts w:ascii="Times New Roman" w:hAnsi="Times New Roman" w:eastAsia="Times New Roman" w:cs="Times New Roman"/>
+          <w:i/>
+          <w:color w:val="000000"/>
+          <w:sz w:val="24"/>
+        </w:rPr>
+        <w:t>p</w:t>
+      </w:r>
+      <w:r>
+        <w:rPr>
+          <w:rFonts w:ascii="Times New Roman" w:hAnsi="Times New Roman" w:eastAsia="Times New Roman" w:cs="Times New Roman"/>
+          <w:color w:val="000000"/>
+          <w:sz w:val="24"/>
+        </w:rPr>
+        <w:t xml:space="preserve"> &lt; 0.001). This tests specific adjacency agreement beyond degree structure, not whether each edge is independently significant or whether the graph recovers real-world cultural relations.</w:t>
       </w:r>
     </w:p>
     <w:p>
@@ -3166,229 +3166,7 @@
           <w:color w:val="000000"/>
           <w:sz w:val="24"/>
         </w:rPr>
-        <w:t>Repeatability is assessed with 250 fixed-seed resamples in which songs are sampled with replacement within each label and both reciprocal-top-five graphs are recomputed. Observed-edge selection frequency ranges from 0.072 to 0.712 (median 0.280); 16 of 86 edges, connecting 25 labels, meet the prespecified 0.50 display gate, and none reaches 0.80. This frequency is neither posterior probability nor statistical confidence. Auxiliary explanations are computed only after an edge exists: duplicate-controlled informative-Dirichlet distinctive wording, song-normalized written endings, and song-level writing-form probes. A signal is displayed only when it reaches the 90th percentile within its support stratum. Forty-eight edges have at least one such concordant signal; 38 remain semantic-only. These probes explain measurable common ground but do not causally decompose the embedding.</w:t>
-      </w:r>
-    </w:p>
-    <w:p>
-      <w:pPr>
-        <w:pStyle w:val="Heading1"/>
-      </w:pPr>
-      <w:r>
-        <w:t>6. Downstream Task 2: Chinese-Rap NER and a Provisional Cultural-Reference Network</w:t>
-      </w:r>
-    </w:p>
-    <w:p>
-      <w:pPr>
-        <w:pStyle w:val="Heading2"/>
-      </w:pPr>
-      <w:r>
-        <w:t>6.1 Schema and Evidence Status</w:t>
-      </w:r>
-    </w:p>
-    <w:p>
-      <w:pPr>
-        <w:widowControl/>
-        <w:spacing w:line="480" w:lineRule="auto" w:after="0"/>
-      </w:pPr>
-      <w:r>
-        <w:rPr>
-          <w:rFonts w:ascii="Times New Roman" w:hAnsi="Times New Roman" w:eastAsia="Times New Roman" w:cs="Times New Roman"/>
-          <w:color w:val="000000"/>
-          <w:sz w:val="24"/>
-        </w:rPr>
-        <w:t xml:space="preserve">The domain schema includes </w:t>
-      </w:r>
-      <w:r>
-        <w:rPr>
-          <w:rFonts w:ascii="Courier New" w:hAnsi="Courier New" w:eastAsia="Courier New" w:cs="Courier New"/>
-          <w:color w:val="000000"/>
-          <w:sz w:val="23"/>
-        </w:rPr>
-        <w:t>PERSON_REFERENCE</w:t>
-      </w:r>
-      <w:r>
-        <w:rPr>
-          <w:rFonts w:ascii="Times New Roman" w:hAnsi="Times New Roman" w:eastAsia="Times New Roman" w:cs="Times New Roman"/>
-          <w:color w:val="000000"/>
-          <w:sz w:val="24"/>
-        </w:rPr>
-        <w:t xml:space="preserve">, </w:t>
-      </w:r>
-      <w:r>
-        <w:rPr>
-          <w:rFonts w:ascii="Courier New" w:hAnsi="Courier New" w:eastAsia="Courier New" w:cs="Courier New"/>
-          <w:color w:val="000000"/>
-          <w:sz w:val="23"/>
-        </w:rPr>
-        <w:t>GROUP_CREW_OR_ORGANIZATION</w:t>
-      </w:r>
-      <w:r>
-        <w:rPr>
-          <w:rFonts w:ascii="Times New Roman" w:hAnsi="Times New Roman" w:eastAsia="Times New Roman" w:cs="Times New Roman"/>
-          <w:color w:val="000000"/>
-          <w:sz w:val="24"/>
-        </w:rPr>
-        <w:t xml:space="preserve">, </w:t>
-      </w:r>
-      <w:r>
-        <w:rPr>
-          <w:rFonts w:ascii="Courier New" w:hAnsi="Courier New" w:eastAsia="Courier New" w:cs="Courier New"/>
-          <w:color w:val="000000"/>
-          <w:sz w:val="23"/>
-        </w:rPr>
-        <w:t>PLACE</w:t>
-      </w:r>
-      <w:r>
-        <w:rPr>
-          <w:rFonts w:ascii="Times New Roman" w:hAnsi="Times New Roman" w:eastAsia="Times New Roman" w:cs="Times New Roman"/>
-          <w:color w:val="000000"/>
-          <w:sz w:val="24"/>
-        </w:rPr>
-        <w:t xml:space="preserve">, </w:t>
-      </w:r>
-      <w:r>
-        <w:rPr>
-          <w:rFonts w:ascii="Courier New" w:hAnsi="Courier New" w:eastAsia="Courier New" w:cs="Courier New"/>
-          <w:color w:val="000000"/>
-          <w:sz w:val="23"/>
-        </w:rPr>
-        <w:t>BRAND_OR_PRODUCT</w:t>
-      </w:r>
-      <w:r>
-        <w:rPr>
-          <w:rFonts w:ascii="Times New Roman" w:hAnsi="Times New Roman" w:eastAsia="Times New Roman" w:cs="Times New Roman"/>
-          <w:color w:val="000000"/>
-          <w:sz w:val="24"/>
-        </w:rPr>
-        <w:t xml:space="preserve">, </w:t>
-      </w:r>
-      <w:r>
-        <w:rPr>
-          <w:rFonts w:ascii="Courier New" w:hAnsi="Courier New" w:eastAsia="Courier New" w:cs="Courier New"/>
-          <w:color w:val="000000"/>
-          <w:sz w:val="23"/>
-        </w:rPr>
-        <w:t>WORK_OR_MEDIA</w:t>
-      </w:r>
-      <w:r>
-        <w:rPr>
-          <w:rFonts w:ascii="Times New Roman" w:hAnsi="Times New Roman" w:eastAsia="Times New Roman" w:cs="Times New Roman"/>
-          <w:color w:val="000000"/>
-          <w:sz w:val="24"/>
-        </w:rPr>
-        <w:t xml:space="preserve">, </w:t>
-      </w:r>
-      <w:r>
-        <w:rPr>
-          <w:rFonts w:ascii="Courier New" w:hAnsi="Courier New" w:eastAsia="Courier New" w:cs="Courier New"/>
-          <w:color w:val="000000"/>
-          <w:sz w:val="23"/>
-        </w:rPr>
-        <w:t>EVENT</w:t>
-      </w:r>
-      <w:r>
-        <w:rPr>
-          <w:rFonts w:ascii="Times New Roman" w:hAnsi="Times New Roman" w:eastAsia="Times New Roman" w:cs="Times New Roman"/>
-          <w:color w:val="000000"/>
-          <w:sz w:val="24"/>
-        </w:rPr>
-        <w:t xml:space="preserve">, </w:t>
-      </w:r>
-      <w:r>
-        <w:rPr>
-          <w:rFonts w:ascii="Courier New" w:hAnsi="Courier New" w:eastAsia="Courier New" w:cs="Courier New"/>
-          <w:color w:val="000000"/>
-          <w:sz w:val="23"/>
-        </w:rPr>
-        <w:t>LANGUAGE_OR_DIALECT_REFERENCE</w:t>
-      </w:r>
-      <w:r>
-        <w:rPr>
-          <w:rFonts w:ascii="Times New Roman" w:hAnsi="Times New Roman" w:eastAsia="Times New Roman" w:cs="Times New Roman"/>
-          <w:color w:val="000000"/>
-          <w:sz w:val="24"/>
-        </w:rPr>
-        <w:t xml:space="preserve">, </w:t>
-      </w:r>
-      <w:r>
-        <w:rPr>
-          <w:rFonts w:ascii="Courier New" w:hAnsi="Courier New" w:eastAsia="Courier New" w:cs="Courier New"/>
-          <w:color w:val="000000"/>
-          <w:sz w:val="23"/>
-        </w:rPr>
-        <w:t>ETHNOCULTURAL_GROUP_REFERENCE</w:t>
-      </w:r>
-      <w:r>
-        <w:rPr>
-          <w:rFonts w:ascii="Times New Roman" w:hAnsi="Times New Roman" w:eastAsia="Times New Roman" w:cs="Times New Roman"/>
-          <w:color w:val="000000"/>
-          <w:sz w:val="24"/>
-        </w:rPr>
-        <w:t xml:space="preserve">, </w:t>
-      </w:r>
-      <w:r>
-        <w:rPr>
-          <w:rFonts w:ascii="Courier New" w:hAnsi="Courier New" w:eastAsia="Courier New" w:cs="Courier New"/>
-          <w:color w:val="000000"/>
-          <w:sz w:val="23"/>
-        </w:rPr>
-        <w:t>RAP_CULTURE_CONCEPT</w:t>
-      </w:r>
-      <w:r>
-        <w:rPr>
-          <w:rFonts w:ascii="Times New Roman" w:hAnsi="Times New Roman" w:eastAsia="Times New Roman" w:cs="Times New Roman"/>
-          <w:color w:val="000000"/>
-          <w:sz w:val="24"/>
-        </w:rPr>
-        <w:t xml:space="preserve">, and </w:t>
-      </w:r>
-      <w:r>
-        <w:rPr>
-          <w:rFonts w:ascii="Courier New" w:hAnsi="Courier New" w:eastAsia="Courier New" w:cs="Courier New"/>
-          <w:color w:val="000000"/>
-          <w:sz w:val="23"/>
-        </w:rPr>
-        <w:t>OTHER_CULTURAL_REFERENCE</w:t>
-      </w:r>
-      <w:r>
-        <w:rPr>
-          <w:rFonts w:ascii="Times New Roman" w:hAnsi="Times New Roman" w:eastAsia="Times New Roman" w:cs="Times New Roman"/>
-          <w:color w:val="000000"/>
-          <w:sz w:val="24"/>
-        </w:rPr>
-        <w:t xml:space="preserve">, plus </w:t>
-      </w:r>
-      <w:r>
-        <w:rPr>
-          <w:rFonts w:ascii="Courier New" w:hAnsi="Courier New" w:eastAsia="Courier New" w:cs="Courier New"/>
-          <w:color w:val="000000"/>
-          <w:sz w:val="23"/>
-        </w:rPr>
-        <w:t>NOT_ENTITY</w:t>
-      </w:r>
-      <w:r>
-        <w:rPr>
-          <w:rFonts w:ascii="Times New Roman" w:hAnsi="Times New Roman" w:eastAsia="Times New Roman" w:cs="Times New Roman"/>
-          <w:color w:val="000000"/>
-          <w:sz w:val="24"/>
-        </w:rPr>
-        <w:t xml:space="preserve"> and </w:t>
-      </w:r>
-      <w:r>
-        <w:rPr>
-          <w:rFonts w:ascii="Courier New" w:hAnsi="Courier New" w:eastAsia="Courier New" w:cs="Courier New"/>
-          <w:color w:val="000000"/>
-          <w:sz w:val="23"/>
-        </w:rPr>
-        <w:t>UNCERTAIN</w:t>
-      </w:r>
-      <w:r>
-        <w:rPr>
-          <w:rFonts w:ascii="Times New Roman" w:hAnsi="Times New Roman" w:eastAsia="Times New Roman" w:cs="Times New Roman"/>
-          <w:color w:val="000000"/>
-          <w:sz w:val="24"/>
-        </w:rPr>
-        <w:t>. A person reference may be real, stage-named, fictional, or mythic; it never automatically denotes a rapper. Reviewers label validity, type, referential status, normalized surface, linking status, confidence, and corrections in private context.</w:t>
+        <w:t>For the global layout, normalized centroids from both text treatments are combined and projected by deterministic principal-components analysis (PCA). The first two components retain 26.2% of profile variation. At five neighbours, trustworthiness is 0.785 and exact high-dimensional-neighbour retention is 0.173, versus a random expectation of 0.025. The map therefore preserves broad structure beyond chance but not every local neighbourhood: only a retained line defines a released match, while screen distance and the focused ego diagram's angle and radius remain non-analytical.</w:t>
       </w:r>
     </w:p>
     <w:p>
@@ -3403,7 +3181,244 @@
           <w:color w:val="000000"/>
           <w:sz w:val="24"/>
         </w:rPr>
-        <w:t>The current corpus has no completed occurrence-level human gold. Two legacy, superseded sets—300 context-review forms and 300 occurrence-review tasks—contain zero completed decisions, and no verified entity or relation registry rows exist. The primary release instead provides a newly sampled 800-occurrence dual-review package. We therefore treat NER as a research-resource and readiness result. No accuracy metric is reported.</w:t>
+        <w:t>Repeatability is assessed with 250 fixed-seed resamples in which songs are sampled with replacement within each label and both reciprocal-top-five graphs are recomputed. Observed-edge selection frequency ranges from 0.072 to 0.712 (median 0.280); 16 of 86 edges, connecting 25 labels, meet the prespecified 0.50 display gate, and none reaches 0.80. This frequency is neither posterior probability nor statistical confidence. Auxiliary explanations are computed only after an edge exists: duplicate-controlled informative-Dirichlet distinctive wording, song-normalized written endings, and song-level writing-form probes. A signal is displayed only when it reaches the 90th percentile within its support stratum. Forty-eight edges have at least one such concordant signal; 38 remain semantic-only. These probes explain measurable common ground but do not causally decompose the embedding.</w:t>
+      </w:r>
+    </w:p>
+    <w:p>
+      <w:pPr>
+        <w:pStyle w:val="Heading1"/>
+      </w:pPr>
+      <w:r>
+        <w:t>6. Downstream Task 2: Chinese-Rap NER and a Provisional Cultural-Reference Network</w:t>
+      </w:r>
+    </w:p>
+    <w:p>
+      <w:pPr>
+        <w:pStyle w:val="Heading2"/>
+      </w:pPr>
+      <w:r>
+        <w:t>6.1 Schema and Evidence Status</w:t>
+      </w:r>
+    </w:p>
+    <w:p>
+      <w:pPr>
+        <w:widowControl/>
+        <w:spacing w:line="480" w:lineRule="auto" w:after="0"/>
+      </w:pPr>
+      <w:r>
+        <w:rPr>
+          <w:rFonts w:ascii="Times New Roman" w:hAnsi="Times New Roman" w:eastAsia="Times New Roman" w:cs="Times New Roman"/>
+          <w:color w:val="000000"/>
+          <w:sz w:val="24"/>
+        </w:rPr>
+        <w:t xml:space="preserve">The domain schema includes </w:t>
+      </w:r>
+      <w:r>
+        <w:rPr>
+          <w:rFonts w:ascii="Courier New" w:hAnsi="Courier New" w:eastAsia="Courier New" w:cs="Courier New"/>
+          <w:color w:val="000000"/>
+          <w:sz w:val="23"/>
+        </w:rPr>
+        <w:t>PERSON_REFERENCE</w:t>
+      </w:r>
+      <w:r>
+        <w:rPr>
+          <w:rFonts w:ascii="Times New Roman" w:hAnsi="Times New Roman" w:eastAsia="Times New Roman" w:cs="Times New Roman"/>
+          <w:color w:val="000000"/>
+          <w:sz w:val="24"/>
+        </w:rPr>
+        <w:t xml:space="preserve">, </w:t>
+      </w:r>
+      <w:r>
+        <w:rPr>
+          <w:rFonts w:ascii="Courier New" w:hAnsi="Courier New" w:eastAsia="Courier New" w:cs="Courier New"/>
+          <w:color w:val="000000"/>
+          <w:sz w:val="23"/>
+        </w:rPr>
+        <w:t>GROUP_CREW_OR_ORGANIZATION</w:t>
+      </w:r>
+      <w:r>
+        <w:rPr>
+          <w:rFonts w:ascii="Times New Roman" w:hAnsi="Times New Roman" w:eastAsia="Times New Roman" w:cs="Times New Roman"/>
+          <w:color w:val="000000"/>
+          <w:sz w:val="24"/>
+        </w:rPr>
+        <w:t xml:space="preserve">, </w:t>
+      </w:r>
+      <w:r>
+        <w:rPr>
+          <w:rFonts w:ascii="Courier New" w:hAnsi="Courier New" w:eastAsia="Courier New" w:cs="Courier New"/>
+          <w:color w:val="000000"/>
+          <w:sz w:val="23"/>
+        </w:rPr>
+        <w:t>PLACE</w:t>
+      </w:r>
+      <w:r>
+        <w:rPr>
+          <w:rFonts w:ascii="Times New Roman" w:hAnsi="Times New Roman" w:eastAsia="Times New Roman" w:cs="Times New Roman"/>
+          <w:color w:val="000000"/>
+          <w:sz w:val="24"/>
+        </w:rPr>
+        <w:t xml:space="preserve">, </w:t>
+      </w:r>
+      <w:r>
+        <w:rPr>
+          <w:rFonts w:ascii="Courier New" w:hAnsi="Courier New" w:eastAsia="Courier New" w:cs="Courier New"/>
+          <w:color w:val="000000"/>
+          <w:sz w:val="23"/>
+        </w:rPr>
+        <w:t>BRAND_OR_PRODUCT</w:t>
+      </w:r>
+      <w:r>
+        <w:rPr>
+          <w:rFonts w:ascii="Times New Roman" w:hAnsi="Times New Roman" w:eastAsia="Times New Roman" w:cs="Times New Roman"/>
+          <w:color w:val="000000"/>
+          <w:sz w:val="24"/>
+        </w:rPr>
+        <w:t xml:space="preserve">, </w:t>
+      </w:r>
+      <w:r>
+        <w:rPr>
+          <w:rFonts w:ascii="Courier New" w:hAnsi="Courier New" w:eastAsia="Courier New" w:cs="Courier New"/>
+          <w:color w:val="000000"/>
+          <w:sz w:val="23"/>
+        </w:rPr>
+        <w:t>WORK_OR_MEDIA</w:t>
+      </w:r>
+      <w:r>
+        <w:rPr>
+          <w:rFonts w:ascii="Times New Roman" w:hAnsi="Times New Roman" w:eastAsia="Times New Roman" w:cs="Times New Roman"/>
+          <w:color w:val="000000"/>
+          <w:sz w:val="24"/>
+        </w:rPr>
+        <w:t xml:space="preserve">, </w:t>
+      </w:r>
+      <w:r>
+        <w:rPr>
+          <w:rFonts w:ascii="Courier New" w:hAnsi="Courier New" w:eastAsia="Courier New" w:cs="Courier New"/>
+          <w:color w:val="000000"/>
+          <w:sz w:val="23"/>
+        </w:rPr>
+        <w:t>EVENT</w:t>
+      </w:r>
+      <w:r>
+        <w:rPr>
+          <w:rFonts w:ascii="Times New Roman" w:hAnsi="Times New Roman" w:eastAsia="Times New Roman" w:cs="Times New Roman"/>
+          <w:color w:val="000000"/>
+          <w:sz w:val="24"/>
+        </w:rPr>
+        <w:t xml:space="preserve">, </w:t>
+      </w:r>
+      <w:r>
+        <w:rPr>
+          <w:rFonts w:ascii="Courier New" w:hAnsi="Courier New" w:eastAsia="Courier New" w:cs="Courier New"/>
+          <w:color w:val="000000"/>
+          <w:sz w:val="23"/>
+        </w:rPr>
+        <w:t>LANGUAGE_OR_DIALECT_REFERENCE</w:t>
+      </w:r>
+      <w:r>
+        <w:rPr>
+          <w:rFonts w:ascii="Times New Roman" w:hAnsi="Times New Roman" w:eastAsia="Times New Roman" w:cs="Times New Roman"/>
+          <w:color w:val="000000"/>
+          <w:sz w:val="24"/>
+        </w:rPr>
+        <w:t xml:space="preserve">, </w:t>
+      </w:r>
+      <w:r>
+        <w:rPr>
+          <w:rFonts w:ascii="Courier New" w:hAnsi="Courier New" w:eastAsia="Courier New" w:cs="Courier New"/>
+          <w:color w:val="000000"/>
+          <w:sz w:val="23"/>
+        </w:rPr>
+        <w:t>ETHNOCULTURAL_GROUP_REFERENCE</w:t>
+      </w:r>
+      <w:r>
+        <w:rPr>
+          <w:rFonts w:ascii="Times New Roman" w:hAnsi="Times New Roman" w:eastAsia="Times New Roman" w:cs="Times New Roman"/>
+          <w:color w:val="000000"/>
+          <w:sz w:val="24"/>
+        </w:rPr>
+        <w:t xml:space="preserve">, </w:t>
+      </w:r>
+      <w:r>
+        <w:rPr>
+          <w:rFonts w:ascii="Courier New" w:hAnsi="Courier New" w:eastAsia="Courier New" w:cs="Courier New"/>
+          <w:color w:val="000000"/>
+          <w:sz w:val="23"/>
+        </w:rPr>
+        <w:t>RAP_CULTURE_CONCEPT</w:t>
+      </w:r>
+      <w:r>
+        <w:rPr>
+          <w:rFonts w:ascii="Times New Roman" w:hAnsi="Times New Roman" w:eastAsia="Times New Roman" w:cs="Times New Roman"/>
+          <w:color w:val="000000"/>
+          <w:sz w:val="24"/>
+        </w:rPr>
+        <w:t xml:space="preserve">, and </w:t>
+      </w:r>
+      <w:r>
+        <w:rPr>
+          <w:rFonts w:ascii="Courier New" w:hAnsi="Courier New" w:eastAsia="Courier New" w:cs="Courier New"/>
+          <w:color w:val="000000"/>
+          <w:sz w:val="23"/>
+        </w:rPr>
+        <w:t>OTHER_CULTURAL_REFERENCE</w:t>
+      </w:r>
+      <w:r>
+        <w:rPr>
+          <w:rFonts w:ascii="Times New Roman" w:hAnsi="Times New Roman" w:eastAsia="Times New Roman" w:cs="Times New Roman"/>
+          <w:color w:val="000000"/>
+          <w:sz w:val="24"/>
+        </w:rPr>
+        <w:t xml:space="preserve">, plus </w:t>
+      </w:r>
+      <w:r>
+        <w:rPr>
+          <w:rFonts w:ascii="Courier New" w:hAnsi="Courier New" w:eastAsia="Courier New" w:cs="Courier New"/>
+          <w:color w:val="000000"/>
+          <w:sz w:val="23"/>
+        </w:rPr>
+        <w:t>NOT_ENTITY</w:t>
+      </w:r>
+      <w:r>
+        <w:rPr>
+          <w:rFonts w:ascii="Times New Roman" w:hAnsi="Times New Roman" w:eastAsia="Times New Roman" w:cs="Times New Roman"/>
+          <w:color w:val="000000"/>
+          <w:sz w:val="24"/>
+        </w:rPr>
+        <w:t xml:space="preserve"> and </w:t>
+      </w:r>
+      <w:r>
+        <w:rPr>
+          <w:rFonts w:ascii="Courier New" w:hAnsi="Courier New" w:eastAsia="Courier New" w:cs="Courier New"/>
+          <w:color w:val="000000"/>
+          <w:sz w:val="23"/>
+        </w:rPr>
+        <w:t>UNCERTAIN</w:t>
+      </w:r>
+      <w:r>
+        <w:rPr>
+          <w:rFonts w:ascii="Times New Roman" w:hAnsi="Times New Roman" w:eastAsia="Times New Roman" w:cs="Times New Roman"/>
+          <w:color w:val="000000"/>
+          <w:sz w:val="24"/>
+        </w:rPr>
+        <w:t>. A person reference may be real, stage-named, fictional, or mythic; it never automatically denotes a rapper. Reviewers label validity, type, referential status, normalized surface, linking status, confidence, and corrections in private context.</w:t>
+      </w:r>
+    </w:p>
+    <w:p>
+      <w:pPr>
+        <w:widowControl/>
+        <w:spacing w:line="480" w:lineRule="auto" w:after="0"/>
+        <w:ind w:firstLine="360"/>
+      </w:pPr>
+      <w:r>
+        <w:rPr>
+          <w:rFonts w:ascii="Times New Roman" w:hAnsi="Times New Roman" w:eastAsia="Times New Roman" w:cs="Times New Roman"/>
+          <w:color w:val="000000"/>
+          <w:sz w:val="24"/>
+        </w:rPr>
+        <w:t>The current corpus has no completed occurrence-level human gold. The primary release provides two blank, complementary packages: an 800-occurrence corpuswide dual-review sample and a claim-directed audit containing all 157 unique occurrences supporting the six released label/reference and four co-mention claims. Both require independent dual review and adjudication; claim/control status is blinded in the claim-directed package, and zero decisions are complete. The claim audit completely covers its released-claim frame but is claim-conditioned, so neither package presently supports precision, recall, F1, inter-annotator agreement, or claim-confirmation rates.</w:t>
       </w:r>
     </w:p>
     <w:p>
@@ -4503,6 +4518,89 @@
                 <w:sz w:val="18"/>
               </w:rPr>
               <w:t>Required path to human gold</w:t>
+            </w:r>
+          </w:p>
+        </w:tc>
+      </w:tr>
+      <w:tr>
+        <w:trPr>
+          <w:cantSplit/>
+        </w:trPr>
+        <w:tc>
+          <w:tcPr>
+            <w:tcW w:type="dxa" w:w="4305"/>
+            <w:vAlign w:val="center"/>
+            <w:tcMar>
+              <w:top w:w="80" w:type="dxa"/>
+              <w:start w:w="90" w:type="dxa"/>
+              <w:bottom w:w="80" w:type="dxa"/>
+              <w:end w:w="90" w:type="dxa"/>
+            </w:tcMar>
+          </w:tcPr>
+          <w:p>
+            <w:pPr>
+              <w:keepLines/>
+              <w:spacing w:line="240" w:lineRule="auto" w:after="0"/>
+            </w:pPr>
+            <w:r>
+              <w:rPr>
+                <w:rFonts w:ascii="Times New Roman" w:hAnsi="Times New Roman" w:eastAsia="Times New Roman" w:cs="Times New Roman"/>
+                <w:color w:val="000000"/>
+                <w:sz w:val="18"/>
+              </w:rPr>
+              <w:t>Claim-directed audit</w:t>
+            </w:r>
+          </w:p>
+        </w:tc>
+        <w:tc>
+          <w:tcPr>
+            <w:tcW w:type="dxa" w:w="2527"/>
+            <w:vAlign w:val="center"/>
+            <w:tcMar>
+              <w:top w:w="80" w:type="dxa"/>
+              <w:start w:w="90" w:type="dxa"/>
+              <w:bottom w:w="80" w:type="dxa"/>
+              <w:end w:w="90" w:type="dxa"/>
+            </w:tcMar>
+          </w:tcPr>
+          <w:p>
+            <w:pPr>
+              <w:keepLines/>
+              <w:spacing w:line="240" w:lineRule="auto" w:after="0"/>
+            </w:pPr>
+            <w:r>
+              <w:rPr>
+                <w:rFonts w:ascii="Times New Roman" w:hAnsi="Times New Roman" w:eastAsia="Times New Roman" w:cs="Times New Roman"/>
+                <w:color w:val="000000"/>
+                <w:sz w:val="18"/>
+              </w:rPr>
+              <w:t>157 unique occurrences</w:t>
+            </w:r>
+          </w:p>
+        </w:tc>
+        <w:tc>
+          <w:tcPr>
+            <w:tcW w:type="dxa" w:w="2528"/>
+            <w:vAlign w:val="center"/>
+            <w:tcMar>
+              <w:top w:w="80" w:type="dxa"/>
+              <w:start w:w="90" w:type="dxa"/>
+              <w:bottom w:w="80" w:type="dxa"/>
+              <w:end w:w="90" w:type="dxa"/>
+            </w:tcMar>
+          </w:tcPr>
+          <w:p>
+            <w:pPr>
+              <w:keepLines/>
+              <w:spacing w:line="240" w:lineRule="auto" w:after="0"/>
+            </w:pPr>
+            <w:r>
+              <w:rPr>
+                <w:rFonts w:ascii="Times New Roman" w:hAnsi="Times New Roman" w:eastAsia="Times New Roman" w:cs="Times New Roman"/>
+                <w:color w:val="000000"/>
+                <w:sz w:val="18"/>
+              </w:rPr>
+              <w:t>All support for ten released claims; 0 reviewed</w:t>
             </w:r>
           </w:p>
         </w:tc>
@@ -6426,7 +6524,7 @@
           <w:color w:val="000000"/>
           <w:sz w:val="24"/>
         </w:rPr>
-        <w:t xml:space="preserve">RQ2 is therefore answered in terms of readiness, leakage sensitivity, and statistically supported aggregate association rather than extraction accuracy. The frozen corpuswide inventory of 33 surfaces contracts to 22 after cross-label shared-text exclusion and the fixed graph universe are applied. The old support/lift-only 85 repertoire links contract first to 40 under the same shared-text control and then to six under song-unit uncertainty and BH-FDR; four entity co-mentions survive the corrected all-song denominator and multiplicity gate. None is human occurrence gold. The 800-item dual-review design is the next required empirical step. Only after adjudication can strict-span micro precision/recall/F1, per-type support, boundary/type errors, inter-annotator agreement, and external uncertainty be reported. Network centrality should remain withheld until error by type and support is understood, because extraction bias can become cultural visibility bias (Lassen </w:t>
+        <w:t xml:space="preserve">RQ2 is therefore answered in terms of readiness, leakage sensitivity, and statistically supported aggregate association rather than extraction accuracy. The frozen corpuswide inventory of 33 surfaces contracts to 22 after cross-label shared-text exclusion and the fixed graph universe are applied. The old support/lift-only 85 repertoire links contract first to 40 under the same shared-text control and then to six under song-unit uncertainty and BH-FDR; four entity co-mentions survive the corrected all-song denominator and multiplicity gate. None is human occurrence gold. The 800-item corpuswide design and unreviewed 157-occurrence released-claim audit are the next required empirical steps. Only after adjudication can strict-span micro precision/recall/F1, per-type support, boundary/type errors, inter-annotator agreement, and external uncertainty be reported. Network centrality should remain withheld until error by type and support is understood, because extraction bias can become cultural visibility bias (Lassen </w:t>
       </w:r>
       <w:r>
         <w:rPr>

</xml_diff>

<commit_message>
Audit corpus lineage and harden publication release
</commit_message>
<xml_diff>
--- a/paper/Chinese_Rap_Evidence_Grounded_Manuscript.docx
+++ b/paper/Chinese_Rap_Evidence_Grounded_Manuscript.docx
@@ -29,7 +29,7 @@
           <w:color w:val="000000"/>
           <w:sz w:val="38"/>
         </w:rPr>
-        <w:t>Language, Reference, and Written Rhyme: Evidence-Grounded Downstream Analysis of Chinese Rap Lyrics</w:t>
+        <w:t>Language, Reference, and Written Rhyme: Evidence‑Grounded Downstream Analysis of Chinese Rap Lyrics</w:t>
       </w:r>
     </w:p>
     <w:p>
@@ -906,7 +906,7 @@
           <w:color w:val="000000"/>
           <w:sz w:val="24"/>
         </w:rPr>
-        <w:t>The export is a convenience snapshot rather than a census. It lacks stable per-track identifiers and verified records for source platforms, acquisition dates, temporal coverage, sampling, transcription origin, and rights or ethics basis. Those owner-supplied facts remain required before submission and are tracked separately; no provenance is inferred from lyrics or filenames. Full reconciliation, exception totals, and checksums appear in the public supplement.</w:t>
+        <w:t>PD-002 reconstructed the legacy cleaner: artist/text deduplication removed 2,894 chunks and 177 song IDs; 131 are conservative duplicate records and 46 require review. The live Drive sheet matched 26,833 keys; all 33 substantive cell differences were adjudicated. Canonical gates explain 7,214/22,132 upstream versus 7,211/22,128 analyzed. Results remain snapshot-conditional.</w:t>
       </w:r>
     </w:p>
     <w:p>
@@ -921,7 +921,22 @@
           <w:color w:val="000000"/>
           <w:sz w:val="24"/>
         </w:rPr>
-        <w:t>The source-credit label is immutable corpus provenance, not independently verified identity. Four titles have externally verified overrides in the metadata sidecar, but the study does not attempt global person resolution. This boundary affects every task: retrieval predicts a corpus label; NER identifies lyric-reference surfaces; rhyme fingerprints summarize label-attached written lines. The public release excludes lyric text, full lines, song/chunk identifiers, membership rows, row-level lyric-content hashes, embeddings, and reviewer contexts. File-level checksums remain as non-content integrity metadata.</w:t>
+        <w:t>The export is a convenience snapshot rather than a census. It lacks stable per-track identifiers and verified records for source platforms, acquisition dates, temporal coverage, sampling, transcription origin, and rights or ethics basis. Those owner-supplied facts remain required; none is inferred from lyrics or filenames. Full reconciliation, exception totals, and checksums appear in the public supplement.</w:t>
+      </w:r>
+    </w:p>
+    <w:p>
+      <w:pPr>
+        <w:widowControl/>
+        <w:spacing w:line="480" w:lineRule="auto" w:after="0"/>
+        <w:ind w:firstLine="360"/>
+      </w:pPr>
+      <w:r>
+        <w:rPr>
+          <w:rFonts w:ascii="Times New Roman" w:hAnsi="Times New Roman" w:eastAsia="Times New Roman" w:cs="Times New Roman"/>
+          <w:color w:val="000000"/>
+          <w:sz w:val="24"/>
+        </w:rPr>
+        <w:t>The source-credit label is corpus provenance, not verified identity; the study does not attempt global person resolution. Retrieval predicts that label, NER identifies lyric-reference surfaces, and rhyme fingerprints summarize label-attached lines. The public release excludes lyric text, full lines, song/chunk identifiers, membership rows, row-level lyric-content hashes, embeddings, and reviewer contexts. File-level checksums remain as non-content integrity metadata.</w:t>
       </w:r>
     </w:p>
     <w:p>
@@ -1730,6 +1745,7 @@
     <w:p>
       <w:pPr>
         <w:pStyle w:val="Caption"/>
+        <w:keepNext w:val="0"/>
       </w:pPr>
       <w:r>
         <w:rPr>
@@ -2993,6 +3009,7 @@
     <w:p>
       <w:pPr>
         <w:pStyle w:val="Caption"/>
+        <w:keepNext w:val="0"/>
       </w:pPr>
       <w:r>
         <w:rPr>
@@ -4614,6 +4631,7 @@
     <w:p>
       <w:pPr>
         <w:pStyle w:val="Caption"/>
+        <w:keepNext w:val="0"/>
       </w:pPr>
       <w:r>
         <w:rPr>
@@ -4718,7 +4736,7 @@
           <w:color w:val="000000"/>
           <w:sz w:val="24"/>
         </w:rPr>
-        <w:t>The rhyme task uses the same 204 source labels and the shared-text-exclusion population. Newline boundaries in cleaned source text define written lines. Empty lines, explicit section or credit headers, lines without Han characters, unclassifiable endings, and lines whose final non-space character is not Han are excluded from the primary estimand. This last rule prevents an earlier ambiguity in which the last Han character could be extracted from a line that actually ended in Latin script, a digit, or another symbol. The retained population contains 283,806 strict-Han-ending line occurrences across 5,619 songs; 52,152 are repeated-line occurrences. Repetition is retained because hooks are part of the written sequence, but every transition must connect two lines that were originally adjacent in the same chunk. No transition bridges an omitted original line.</w:t>
+        <w:t>The rhyme task uses the same 204 source labels and the shared-text-exclusion population. Newline boundaries in cleaned source text define written lines. Empty lines, explicit section or credit headers, lines without Han characters, unclassifiable endings, and lines whose final non-space character is not Han are excluded from the primary estimand. This last rule prevents an earlier ambiguity in which the last Han character could be extracted from a line that actually ended in Latin script, a digit, or another symbol. The fixed task universe has 5,619 songs: 5,452 contribute 283,806 strict-Han-ending lines and 5,347 contribute 238,881 adjacent transitions. Its 52,152 repeat count is excess after first within label/song; repeats retain surviving positions and transitions preserve original adjacency. Reconnecting eligible pre-snapshot chunks adds 7,033 lines and 4,938 transitions, with task-universe total variation 0.001789 and switch-rate change 0.001390; prediction models were not retrained.</w:t>
       </w:r>
     </w:p>
     <w:p>
@@ -6131,6 +6149,7 @@
     <w:p>
       <w:pPr>
         <w:pStyle w:val="Caption"/>
+        <w:keepNext w:val="0"/>
       </w:pPr>
       <w:r>
         <w:rPr>
@@ -6716,7 +6735,7 @@
           <w:color w:val="000000"/>
           <w:sz w:val="24"/>
         </w:rPr>
-        <w:t xml:space="preserve"> 2023; Wang and Lin 2024). The strict estimand excludes code-switched and other non-Han terminal characters, so it does not describe every line in the corpus. Repeated lines are retained with their original adjacency because hooks are real compositional structure; a non-repeated-target sensitivity analysis shows that the headline ranking result is not solely driven by them. Ending-family prediction must not be described as performed rhyme or flow.</w:t>
+        <w:t xml:space="preserve"> 2023; Wang and Lin 2024). The strict estimand excludes code-switched and other non-Han terminal characters, so it does not describe every line in the corpus. Repeats retain original adjacency only inside chunks surviving legacy deduplication; the non-repeat sensitivity supports the frozen result. The counterfactual supports aggregate family shares and switch rate, not unretrained prediction metrics. Ending-family prediction must not be described as performed rhyme or flow.</w:t>
       </w:r>
     </w:p>
     <w:p>

</xml_diff>

<commit_message>
Tighten manuscript and repaired-corpus claim boundaries
</commit_message>
<xml_diff>
--- a/paper/Chinese_Rap_Evidence_Grounded_Manuscript.docx
+++ b/paper/Chinese_Rap_Evidence_Grounded_Manuscript.docx
@@ -236,7 +236,7 @@
           <w:color w:val="000000"/>
           <w:sz w:val="24"/>
         </w:rPr>
-        <w:t>A text embedding is an intermediate representation, not a cultural finding. It becomes useful evidence only after researchers specify what the vector must do, define the unit on which it will be tested, compare it with simpler alternatives, control leakage, quantify uncertainty, and explain when the system should abstain. These requirements are easy to obscure in an interactive map: a screen can place two performers close together even when the underlying proximity is unstable, caused by repeated text, or semantically opaque. The visualization then appears to answer a question that the method never posed.</w:t>
+        <w:t>A text embedding becomes cultural evidence only after researchers specify its task and test unit, compare simpler alternatives, control leakage, quantify uncertainty, and define abstention. An interactive map can otherwise imply a stable relation when proximity is repeated, unstable, or opaque, answering a question the method never posed.</w:t>
       </w:r>
     </w:p>
     <w:p>
@@ -251,7 +251,7 @@
           <w:color w:val="000000"/>
           <w:sz w:val="24"/>
         </w:rPr>
-        <w:t xml:space="preserve">Chinese rap makes this problem unusually visible. Its lyrics combine Mandarin with English and other linguistic material, names and cultural references, repeated hooks, non-standard spellings, line-final phonetic patterning, and metadata that may conflate individuals, groups, aliases, and collaborations. No single representation can safely turn these heterogeneous signals into a claim about “style”. Work on authorship representation shows that topic and proper nouns can contribute strongly to apparently stylistic discrimination (Sundararajan and Woodard 2018; Wang </w:t>
+        <w:t xml:space="preserve">Chinese rap makes this problem visible: Mandarin and English, cultural references, repeated hooks, non-standard spelling, line-final form, and ambiguous credit metadata coexist. No representation can safely collapse these signals into “style”. Topic and proper nouns can drive apparently stylistic discrimination (Sundararajan and Woodard 2018; Wang </w:t>
       </w:r>
       <w:r>
         <w:rPr>
@@ -268,7 +268,7 @@
           <w:color w:val="000000"/>
           <w:sz w:val="24"/>
         </w:rPr>
-        <w:t xml:space="preserve"> 2023). A source-label match may therefore reflect subject matter, named worlds, repeated expressions, writing form, or combinations of these—not a pure and stable personal essence.</w:t>
+        <w:t xml:space="preserve"> 2023), so a source-label match may reflect subject matter, named worlds, repetition, or writing form rather than a personal essence.</w:t>
       </w:r>
     </w:p>
     <w:p>
@@ -332,7 +332,7 @@
           <w:color w:val="000000"/>
           <w:sz w:val="24"/>
         </w:rPr>
-        <w:t>The article makes three linked contributions. First, strict fixed-corpus retrieval compares frozen BGE-M3, character 2–5-gram term frequency–inverse document frequency (TF–IDF), and untuned fusion after removing each query song and detected duplicates from candidate profiles. Second, a Chinese-rap named-entity recognition (NER) schema, two candidate baselines, an 800-occurrence dual-review package, and a provisional cultural-reference network make every edge textual and typed; incomplete human review precludes precision, recall, or an F1 score (the harmonic mean of precision and recall). Third, a 17-class model predicts strictly adjacent dictionary-estimated written endings, separates continuation from switching, tests the value of source-label input, and supports validation-defined abstention.</w:t>
+        <w:t>The article contributes three linked evaluations. Strict retrieval compares frozen BGE-M3, character 2–5-gram TF–IDF, and untuned fusion after query and duplicate removal. A Chinese-rap NER schema, two candidate baselines, an 800-occurrence review package, and a provisional typed network keep extraction accuracy withheld until review. A 17-class model predicts adjacent dictionary-estimated written endings, separates continuation from switching, tests source-label input, and supports validation-defined abstention.</w:t>
       </w:r>
     </w:p>
     <w:p>
@@ -347,7 +347,7 @@
           <w:color w:val="000000"/>
           <w:sz w:val="24"/>
         </w:rPr>
-        <w:t>These tasks capture complementary dimensions. Retrieval asks what a held-out song resembles in the corpus. NER asks which named cultural worlds are referenced and how those references aggregate. Written-ending prediction asks how line-final form changes across a sequence. The companion results interface exposes these outputs as three actions—exploring a repertoire, a cultural reference, or a possible next written-ending class—but the interface does not substitute for the paper's methods or evidence.</w:t>
+        <w:t>Retrieval asks what a held-out song resembles; NER asks which named cultural worlds are referenced; written-ending prediction asks how line-final form changes. The companion interface exposes these outputs but does not substitute for the methods or evidence.</w:t>
       </w:r>
     </w:p>
     <w:p>
@@ -520,7 +520,7 @@
           <w:color w:val="000000"/>
           <w:sz w:val="24"/>
         </w:rPr>
-        <w:t xml:space="preserve">Chinese rap is not simply an English-language genre transferred into Chinese text. Ethnographic and lyric-centered studies show performers reworking global hip-hop resources through regional language, Putonghua, English, slang, local knowledge, and place to construct locally meaningful positions (Barrett 2012; Wang 2013; Liu 2014). Work on Higher Brothers further separates written multilingual material from the vocal intelligibility and production through which local, national, and global identities are negotiated (Liu 2021). These studies motivate </w:t>
+        <w:t xml:space="preserve">Ethnographic and lyric-centered studies show Chinese performers reworking global hip-hop through regional language, Putonghua, English, slang, local knowledge, and place (Barrett 2012; Wang 2013; Liu 2014). Work on Higher Brothers separates written multilingual material from the vocal intelligibility and production through which identities are negotiated (Liu 2021). These studies motivate </w:t>
       </w:r>
       <w:r>
         <w:rPr>
@@ -537,7 +537,7 @@
           <w:color w:val="000000"/>
           <w:sz w:val="24"/>
         </w:rPr>
-        <w:t xml:space="preserve"> as a situated bundle of recurring corpus evidence, while ruling out authenticity scores or a fixed real-world identity inferred from text alone.</w:t>
+        <w:t xml:space="preserve"> as situated corpus evidence, not an authenticity score or fixed identity inferred from text.</w:t>
       </w:r>
     </w:p>
     <w:p>
@@ -574,7 +574,7 @@
           <w:color w:val="000000"/>
           <w:sz w:val="24"/>
         </w:rPr>
-        <w:t xml:space="preserve">BGE-M3 was designed for multilingual, multi-function, and multi-granularity retrieval and supports a dense representation suitable for mixed-language passages (Chen </w:t>
+        <w:t xml:space="preserve">BGE-M3 supports multilingual, multi-function, multi-granularity retrieval and dense representation of variable-length mixed-language passages (Chen </w:t>
       </w:r>
       <w:r>
         <w:rPr>
@@ -591,7 +591,7 @@
           <w:color w:val="000000"/>
           <w:sz w:val="24"/>
         </w:rPr>
-        <w:t xml:space="preserve"> 2024). Those properties make it a plausible starting point for Chinese lyrics containing Chinese and English material of variable length. They do not validate it on Chinese rap. A model trained for broad retrieval may encode topical, lexical, and named-entity signals that are useful for finding related text while remaining unsuitable for claims about individual artistic style.</w:t>
+        <w:t xml:space="preserve"> 2024). This makes it plausible for Chinese–English lyrics but does not validate it on Chinese rap: broad retrieval signals may help find related text without isolating artistic style.</w:t>
       </w:r>
     </w:p>
     <w:p>
@@ -606,7 +606,7 @@
           <w:color w:val="000000"/>
           <w:sz w:val="24"/>
         </w:rPr>
-        <w:t xml:space="preserve">That distinction follows research on authorship representation. Sundararajan and Woodard (2018) demonstrate the influence of common and proper nouns in attribution and use masking to expose topic interference. Wang </w:t>
+        <w:t xml:space="preserve">Authorship research shows that common and proper nouns affect attribution and that prediction does not establish style–content disentanglement (Sundararajan and Woodard 2018; Wang </w:t>
       </w:r>
       <w:r>
         <w:rPr>
@@ -623,7 +623,7 @@
           <w:color w:val="000000"/>
           <w:sz w:val="24"/>
         </w:rPr>
-        <w:t xml:space="preserve"> (2023) similarly argue that success on authorship prediction does not establish disentanglement of style from content. We therefore evaluate a </w:t>
+        <w:t xml:space="preserve"> 2023). We therefore test </w:t>
       </w:r>
       <w:r>
         <w:rPr>
@@ -640,7 +640,7 @@
           <w:color w:val="000000"/>
           <w:sz w:val="24"/>
         </w:rPr>
-        <w:t xml:space="preserve"> task rather than “rapper identification”, compare dense representation with a strong surface-form baseline, and interpret fusion as complementarity rather than proof that either channel isolates style.</w:t>
+        <w:t>, not “rapper identification”, against a strong surface-form baseline and interpret fusion as complementarity rather than isolated style.</w:t>
       </w:r>
     </w:p>
     <w:p>
@@ -662,7 +662,7 @@
           <w:color w:val="000000"/>
           <w:sz w:val="24"/>
         </w:rPr>
-        <w:t xml:space="preserve">Chinese NER is sensitive to domain, script, tokenization, and annotation conventions. Work on Chinese social-media NER shows why models built for edited text should not be assumed to transfer to informal language (Peng and Dredze 2015). Lexicon-enhanced architectures such as FLAT demonstrate that character and word information can be combined effectively (Li </w:t>
+        <w:t xml:space="preserve">Chinese NER is domain- and annotation-sensitive; edited-text models cannot be assumed to transfer to informal language (Peng and Dredze 2015). FLAT combines character and word information (Li </w:t>
       </w:r>
       <w:r>
         <w:rPr>
@@ -679,7 +679,7 @@
           <w:color w:val="000000"/>
           <w:sz w:val="24"/>
         </w:rPr>
-        <w:t xml:space="preserve"> 2020), while distantly supervised NER research shows that dictionary matches are incomplete and noisy rather than ready-made gold annotations (Yang </w:t>
+        <w:t xml:space="preserve"> 2020), while distant-supervision work shows that dictionary matches are noisy, not gold (Yang </w:t>
       </w:r>
       <w:r>
         <w:rPr>
@@ -696,7 +696,7 @@
           <w:color w:val="000000"/>
           <w:sz w:val="24"/>
         </w:rPr>
-        <w:t xml:space="preserve"> 2018). Domain-matched corpora also require explicit annotation-quality reporting (Jiang </w:t>
+        <w:t xml:space="preserve"> 2018). Domain corpora require explicit annotation-quality reporting (Jiang </w:t>
       </w:r>
       <w:r>
         <w:rPr>
@@ -728,7 +728,7 @@
           <w:color w:val="000000"/>
           <w:sz w:val="24"/>
         </w:rPr>
-        <w:t xml:space="preserve">NER errors determine which actors and places become visible; unequal error can therefore distort cultural knowledge (Lassen </w:t>
+        <w:t xml:space="preserve">Unequal NER error can distort cultural visibility (Lassen </w:t>
       </w:r>
       <w:r>
         <w:rPr>
@@ -745,7 +745,7 @@
           <w:color w:val="000000"/>
           <w:sz w:val="24"/>
         </w:rPr>
-        <w:t xml:space="preserve"> 2024). Literary-network work shows that nodes, windows, and relations must follow the research question (Blessing </w:t>
+        <w:t xml:space="preserve"> 2024). Literary-network nodes, windows, and relations must follow the question, and co-occurrence differs from embedding similarity (Blessing </w:t>
       </w:r>
       <w:r>
         <w:rPr>
@@ -762,7 +762,7 @@
           <w:color w:val="000000"/>
           <w:sz w:val="24"/>
         </w:rPr>
-        <w:t xml:space="preserve"> 2017), and that co-occurrence and embedding similarity are distinct evidence layers (Rafaeli </w:t>
+        <w:t xml:space="preserve"> 2017; Rafaeli </w:t>
       </w:r>
       <w:r>
         <w:rPr>
@@ -779,7 +779,7 @@
           <w:color w:val="000000"/>
           <w:sz w:val="24"/>
         </w:rPr>
-        <w:t xml:space="preserve"> 2026). In Chinese rap, language and place can localize a repertoire (Liu 2014), while named references gain meaning through stylization and performance (Baioud 2024). We therefore keep source-label/reference and same-song co-mention edges separate, preserve provenance and status, and call neither social nor biographical.</w:t>
+        <w:t xml:space="preserve"> 2026). Because language, place, stylization, and performance localize Chinese-rap repertoires (Liu 2014; Baioud 2024), we separate source-label/reference from same-song co-mention edges and call neither social nor biographical.</w:t>
       </w:r>
     </w:p>
     <w:p>
@@ -801,7 +801,7 @@
           <w:color w:val="000000"/>
           <w:sz w:val="24"/>
         </w:rPr>
-        <w:t xml:space="preserve">Computational rhyme research has modeled phonetic similarity, imperfect rhyme, internal rhyme, and artist-level rhyme profiles (Hirjee and Brown 2009). Chinese lyric-generation systems likewise make rhyme representations explicit: DeepRapper models rhyme alongside beat symbols (Xue </w:t>
+        <w:t xml:space="preserve">Computational work models phonetic, imperfect, internal, and artist-level rhyme (Hirjee and Brown 2009). DeepRapper represents rhyme with beat symbols (Xue </w:t>
       </w:r>
       <w:r>
         <w:rPr>
@@ -835,7 +835,7 @@
           <w:color w:val="000000"/>
           <w:sz w:val="24"/>
         </w:rPr>
-        <w:t xml:space="preserve"> 2023). Chinese-rap scholarship shows why a text-only target must remain narrower. Rhyme participates in persona only within a multimodal analysis (Lin and Wang 2024); performers can create imperfect and Chinese–English rhymes through regional and phonetic variation that fixed pinyin classes miss (Wang and Lin 2024); and audio-based work links tonal realization and English use to flow (Liu </w:t>
+        <w:t xml:space="preserve"> 2023). A text-only Chinese-rap target must remain narrower: multimodal persona, regional or Chinese–English realization, and audio flow exceed fixed pinyin classes (Lin and Wang 2024; Wang and Lin 2024; Liu </w:t>
       </w:r>
       <w:r>
         <w:rPr>
@@ -852,7 +852,7 @@
           <w:color w:val="000000"/>
           <w:sz w:val="24"/>
         </w:rPr>
-        <w:t xml:space="preserve"> 2023). Without aligned audio, the present study cannot observe performed pronunciation, tone, stress, rhythm, cadence, beat alignment, or delivery. Its target is therefore named precisely: a </w:t>
+        <w:t xml:space="preserve"> 2023). Without aligned audio, we cannot observe performed pronunciation, stress, rhythm, cadence, beat, or delivery; the target is a </w:t>
       </w:r>
       <w:r>
         <w:rPr>
@@ -906,7 +906,7 @@
           <w:color w:val="000000"/>
           <w:sz w:val="24"/>
         </w:rPr>
-        <w:t>PD-002 reconstructed the legacy cleaner: artist/text deduplication removed 2,894 chunks and 177 song IDs; 131 are conservative duplicate records and 46 require review. The live Drive sheet matched 26,833 keys; all 33 substantive cell differences were adjudicated. Canonical gates explain 7,214/22,132 upstream versus 7,211/22,128 analyzed. Results remain snapshot-conditional.</w:t>
+        <w:t>PD-002 reconstructed the legacy cleaner: artist/text deduplication removed 2,894 chunks and 177 song IDs; 131 meet a conservative duplicate-record rule and 46 require review. The live Drive sheet matched 26,833 keys; all 33 substantive cell differences were adjudicated. Canonical gates explain 7,214/22,132 upstream versus 7,211/22,128 analyzed. Results remain snapshot-conditional.</w:t>
       </w:r>
     </w:p>
     <w:p>
@@ -4736,7 +4736,7 @@
           <w:color w:val="000000"/>
           <w:sz w:val="24"/>
         </w:rPr>
-        <w:t>The rhyme task uses the same 204 source labels and the shared-text-exclusion population. Newline boundaries in cleaned source text define written lines. Empty lines, explicit section or credit headers, lines without Han characters, unclassifiable endings, and lines whose final non-space character is not Han are excluded from the primary estimand. This last rule prevents an earlier ambiguity in which the last Han character could be extracted from a line that actually ended in Latin script, a digit, or another symbol. The fixed task universe has 5,619 songs: 5,452 contribute 283,806 strict-Han-ending lines and 5,347 contribute 238,881 adjacent transitions. Its 52,152 repeat count is excess after first within label/song; repeats retain surviving positions and transitions preserve original adjacency. Reconnecting eligible pre-snapshot chunks adds 7,033 lines and 4,938 transitions, with task-universe total variation 0.001789 and switch-rate change 0.001390; prediction models were not retrained.</w:t>
+        <w:t>The rhyme task uses 204 source labels after shared-text exclusion. Cleaned newlines define written lines; empty, header, non-Han, unclassifiable, or non-Han-terminal lines are excluded. The frozen task universe has 5,619 songs: 5,452 yield 283,806 strict-Han-ending lines and 5,347 yield 238,881 adjacent transitions. Its 52,152 repeat count is excess after first within label/song; surviving positions and original adjacency are retained. Reconnecting eligible pre-snapshot chunks holds labels fixed but expands songs to 5,621, line-bearing songs to 5,459, and transition-bearing songs to 5,353; it adds 7,033 lines and 4,938 transitions. Total variation is 0.001789 and the switch-rate change is 0.001390; prediction models were not retrained.</w:t>
       </w:r>
     </w:p>
     <w:p>
@@ -6809,7 +6809,7 @@
           <w:color w:val="000000"/>
           <w:sz w:val="24"/>
         </w:rPr>
-        <w:t>Copyright-safe aggregate outputs, the original method contract and formal PD-001 protocol amendment, validation manifests, annotation schema and blank review templates, model builders, and figure-source tables are maintained at https://github.com/Mo119m/chinese-rap-embeddings-to-evidence. The public package excludes lyric text, full written lines, song/chunk identifiers, row-level lyric-content hashes, embeddings, private membership rows, and reviewer contexts. The frozen private corpus cannot be redistributed by this article. Its integrity is documented through file-level checksums and deterministic audit summaries so researchers with lawful access can reproduce the transformations against their copy. [Archival DOI to be added by the authors before submission.]</w:t>
+        <w:t>Copyright-safe aggregate outputs, the original method contract, formal PD-001 and PD-002 amendments, corpus-reconciliation results, validation manifests, annotation materials, model builders, and figure-source tables are maintained at https://github.com/Mo119m/chinese-rap-embeddings-to-evidence. The public package excludes lyric text, full lines, song/chunk identifiers, row-level lyric-content hashes, embeddings, membership rows, and reviewer contexts. The private corpus is not redistributed. File-level checksums and deterministic audits support reproduction by researchers with lawful access. [Archival DOI to be added before submission.]</w:t>
       </w:r>
     </w:p>
     <w:p>

</xml_diff>